<commit_message>
Unit 2 project: fuller prompts, Program Plan tables, clearer turn-in rules
Prompt: a "your program should" list for each prompt, save/load with a
missing-file fallback, video submitted as a viewable link (ScreenPal,
YouTube, Drive, Box, OneDrive), -10% for code that crashes, the AI
comment rule in the requirements, a note that grading follows this
page's rubric, and a clearer # @title requirement.

Proposal: one shared document turned in once; new Program Plan tables
(functions, class, variables, files) in the starter doc, with rubric
wording matched to them. Total stays 30.

Co-Authored-By: Claude Opus 5.5 <noreply@anthropic.com>
</commit_message>
<xml_diff>
--- a/docs/unit2/07_unit2_project/HW-Project-2-Pseudocode.docx
+++ b/docs/unit2/07_unit2_project/HW-Project-2-Pseudocode.docx
@@ -122,6 +122,1042 @@
         </w:rPr>
       </w:pPr>
     </w:p>
+    <w:p>
+      <w:pPr>
+        <w:jc w:val="center"/>
+        <w:rPr>
+          <w:rFonts w:ascii="Vidaloka" w:eastAsia="Vidaloka" w:hAnsi="Vidaloka" w:cs="Vidaloka"/>
+          <w:b/>
+          <w:bCs/>
+          <w:sz w:val="28"/>
+          <w:szCs w:val="28"/>
+        </w:rPr>
+      </w:pPr>
+      <w:r>
+        <w:rPr>
+          <w:rFonts w:ascii="Vidaloka" w:eastAsia="Vidaloka" w:hAnsi="Vidaloka" w:cs="Vidaloka"/>
+          <w:b/>
+          <w:bCs/>
+          <w:sz w:val="28"/>
+          <w:szCs w:val="28"/>
+        </w:rPr>
+        <w:t>Program Plan:</w:t>
+      </w:r>
+    </w:p>
+    <w:p/>
+    <w:p>
+      <w:r>
+        <w:rPr>
+          <w:rFonts w:ascii="Nunito" w:hAnsi="Nunito"/>
+          <w:i/>
+        </w:rPr>
+        <w:t>Fill in each table below. Everything you list should show up somewhere in your pseudocode above. The grey row in each table is an example. Replace it with your own. This is a plan: your final project can be different.</w:t>
+      </w:r>
+    </w:p>
+    <w:p/>
+    <w:p>
+      <w:pPr>
+        <w:keepNext/>
+        <w:jc w:val="center"/>
+        <w:rPr>
+          <w:rFonts w:ascii="Vidaloka" w:eastAsia="Vidaloka" w:hAnsi="Vidaloka" w:cs="Vidaloka"/>
+          <w:b/>
+          <w:bCs/>
+          <w:sz w:val="28"/>
+          <w:szCs w:val="28"/>
+        </w:rPr>
+      </w:pPr>
+      <w:r>
+        <w:rPr>
+          <w:rFonts w:ascii="Vidaloka" w:eastAsia="Vidaloka" w:hAnsi="Vidaloka" w:cs="Vidaloka"/>
+          <w:b/>
+          <w:bCs/>
+          <w:sz w:val="24"/>
+          <w:szCs w:val="28"/>
+        </w:rPr>
+        <w:t>Functions (at least 3):</w:t>
+      </w:r>
+    </w:p>
+    <w:tbl>
+      <w:tblPr>
+        <w:tblStyle w:val="a"/>
+        <w:tblW w:w="9800" w:type="dxa"/>
+        <w:jc w:val="center"/>
+        <w:tblInd w:w="0" w:type="dxa"/>
+        <w:tblBorders>
+          <w:top w:val="single" w:sz="8" w:space="0" w:color="000000"/>
+          <w:left w:val="single" w:sz="8" w:space="0" w:color="000000"/>
+          <w:bottom w:val="single" w:sz="8" w:space="0" w:color="000000"/>
+          <w:right w:val="single" w:sz="8" w:space="0" w:color="000000"/>
+          <w:insideH w:val="single" w:sz="8" w:space="0" w:color="000000"/>
+          <w:insideV w:val="single" w:sz="8" w:space="0" w:color="000000"/>
+        </w:tblBorders>
+        <w:tblLayout w:type="fixed"/>
+        <w:tblLook w:val="0600" w:firstRow="0" w:lastRow="0" w:firstColumn="0" w:lastColumn="0" w:noHBand="1" w:noVBand="1"/>
+      </w:tblPr>
+      <w:tblGrid>
+        <w:gridCol w:w="2340"/>
+        <w:gridCol w:w="2340"/>
+        <w:gridCol w:w="2340"/>
+        <w:gridCol w:w="2340"/>
+      </w:tblGrid>
+      <w:tr>
+        <w:trPr>
+          <w:cantSplit/>
+        </w:trPr>
+        <w:tc>
+          <w:tcPr>
+            <w:tcW w:type="dxa" w:w="1866"/>
+          </w:tcPr>
+          <w:p>
+            <w:pPr>
+              <w:keepNext/>
+            </w:pPr>
+            <w:r>
+              <w:rPr>
+                <w:rFonts w:ascii="Vidaloka" w:hAnsi="Vidaloka"/>
+                <w:b/>
+                <w:sz w:val="24"/>
+              </w:rPr>
+              <w:t>Function name</w:t>
+            </w:r>
+          </w:p>
+        </w:tc>
+        <w:tc>
+          <w:tcPr>
+            <w:tcW w:type="dxa" w:w="2333"/>
+          </w:tcPr>
+          <w:p>
+            <w:pPr>
+              <w:keepNext/>
+            </w:pPr>
+            <w:r>
+              <w:rPr>
+                <w:rFonts w:ascii="Vidaloka" w:hAnsi="Vidaloka"/>
+                <w:b/>
+                <w:sz w:val="24"/>
+              </w:rPr>
+              <w:t>Inputs</w:t>
+            </w:r>
+          </w:p>
+        </w:tc>
+        <w:tc>
+          <w:tcPr>
+            <w:tcW w:type="dxa" w:w="3733"/>
+          </w:tcPr>
+          <w:p>
+            <w:pPr>
+              <w:keepNext/>
+            </w:pPr>
+            <w:r>
+              <w:rPr>
+                <w:rFonts w:ascii="Vidaloka" w:hAnsi="Vidaloka"/>
+                <w:b/>
+                <w:sz w:val="24"/>
+              </w:rPr>
+              <w:t>What it does</w:t>
+            </w:r>
+          </w:p>
+        </w:tc>
+        <w:tc>
+          <w:tcPr>
+            <w:tcW w:type="dxa" w:w="1866"/>
+          </w:tcPr>
+          <w:p>
+            <w:pPr>
+              <w:keepNext/>
+            </w:pPr>
+            <w:r>
+              <w:rPr>
+                <w:rFonts w:ascii="Vidaloka" w:hAnsi="Vidaloka"/>
+                <w:b/>
+                <w:sz w:val="24"/>
+              </w:rPr>
+              <w:t>What it returns</w:t>
+            </w:r>
+          </w:p>
+        </w:tc>
+      </w:tr>
+      <w:tr>
+        <w:trPr>
+          <w:cantSplit/>
+        </w:trPr>
+        <w:tc>
+          <w:tcPr>
+            <w:tcW w:type="dxa" w:w="1866"/>
+          </w:tcPr>
+          <w:p>
+            <w:pPr>
+              <w:keepNext/>
+            </w:pPr>
+            <w:r>
+              <w:rPr>
+                <w:rFonts w:ascii="Nunito" w:hAnsi="Nunito"/>
+                <w:i/>
+                <w:color w:val="808080"/>
+                <w:sz w:val="20"/>
+              </w:rPr>
+              <w:t>add_item</w:t>
+            </w:r>
+          </w:p>
+        </w:tc>
+        <w:tc>
+          <w:tcPr>
+            <w:tcW w:type="dxa" w:w="2333"/>
+          </w:tcPr>
+          <w:p>
+            <w:pPr>
+              <w:keepNext/>
+            </w:pPr>
+            <w:r>
+              <w:rPr>
+                <w:rFonts w:ascii="Nunito" w:hAnsi="Nunito"/>
+                <w:i/>
+                <w:color w:val="808080"/>
+                <w:sz w:val="20"/>
+              </w:rPr>
+              <w:t>inventory, name, quantity, price</w:t>
+            </w:r>
+          </w:p>
+        </w:tc>
+        <w:tc>
+          <w:tcPr>
+            <w:tcW w:type="dxa" w:w="3733"/>
+          </w:tcPr>
+          <w:p>
+            <w:pPr>
+              <w:keepNext/>
+            </w:pPr>
+            <w:r>
+              <w:rPr>
+                <w:rFonts w:ascii="Nunito" w:hAnsi="Nunito"/>
+                <w:i/>
+                <w:color w:val="808080"/>
+                <w:sz w:val="20"/>
+              </w:rPr>
+              <w:t>Adds a new item, or adds to the quantity if it is already there</w:t>
+            </w:r>
+          </w:p>
+        </w:tc>
+        <w:tc>
+          <w:tcPr>
+            <w:tcW w:type="dxa" w:w="1866"/>
+          </w:tcPr>
+          <w:p>
+            <w:pPr>
+              <w:keepNext/>
+            </w:pPr>
+            <w:r>
+              <w:rPr>
+                <w:rFonts w:ascii="Nunito" w:hAnsi="Nunito"/>
+                <w:i/>
+                <w:color w:val="808080"/>
+                <w:sz w:val="20"/>
+              </w:rPr>
+              <w:t>The updated inventory</w:t>
+            </w:r>
+          </w:p>
+        </w:tc>
+      </w:tr>
+      <w:tr>
+        <w:trPr>
+          <w:cantSplit/>
+        </w:trPr>
+        <w:tc>
+          <w:tcPr>
+            <w:tcW w:type="dxa" w:w="1866"/>
+          </w:tcPr>
+          <w:p>
+            <w:pPr>
+              <w:keepNext/>
+            </w:pPr>
+          </w:p>
+        </w:tc>
+        <w:tc>
+          <w:tcPr>
+            <w:tcW w:type="dxa" w:w="2333"/>
+          </w:tcPr>
+          <w:p>
+            <w:pPr>
+              <w:keepNext/>
+            </w:pPr>
+          </w:p>
+        </w:tc>
+        <w:tc>
+          <w:tcPr>
+            <w:tcW w:type="dxa" w:w="3733"/>
+          </w:tcPr>
+          <w:p>
+            <w:pPr>
+              <w:keepNext/>
+            </w:pPr>
+          </w:p>
+        </w:tc>
+        <w:tc>
+          <w:tcPr>
+            <w:tcW w:type="dxa" w:w="1866"/>
+          </w:tcPr>
+          <w:p>
+            <w:pPr>
+              <w:keepNext/>
+            </w:pPr>
+          </w:p>
+        </w:tc>
+      </w:tr>
+      <w:tr>
+        <w:trPr>
+          <w:cantSplit/>
+        </w:trPr>
+        <w:tc>
+          <w:tcPr>
+            <w:tcW w:type="dxa" w:w="1866"/>
+          </w:tcPr>
+          <w:p>
+            <w:pPr>
+              <w:keepNext/>
+            </w:pPr>
+          </w:p>
+        </w:tc>
+        <w:tc>
+          <w:tcPr>
+            <w:tcW w:type="dxa" w:w="2333"/>
+          </w:tcPr>
+          <w:p>
+            <w:pPr>
+              <w:keepNext/>
+            </w:pPr>
+          </w:p>
+        </w:tc>
+        <w:tc>
+          <w:tcPr>
+            <w:tcW w:type="dxa" w:w="3733"/>
+          </w:tcPr>
+          <w:p>
+            <w:pPr>
+              <w:keepNext/>
+            </w:pPr>
+          </w:p>
+        </w:tc>
+        <w:tc>
+          <w:tcPr>
+            <w:tcW w:type="dxa" w:w="1866"/>
+          </w:tcPr>
+          <w:p>
+            <w:pPr>
+              <w:keepNext/>
+            </w:pPr>
+          </w:p>
+        </w:tc>
+      </w:tr>
+      <w:tr>
+        <w:trPr>
+          <w:cantSplit/>
+        </w:trPr>
+        <w:tc>
+          <w:tcPr>
+            <w:tcW w:type="dxa" w:w="1866"/>
+          </w:tcPr>
+          <w:p/>
+        </w:tc>
+        <w:tc>
+          <w:tcPr>
+            <w:tcW w:type="dxa" w:w="2333"/>
+          </w:tcPr>
+          <w:p/>
+        </w:tc>
+        <w:tc>
+          <w:tcPr>
+            <w:tcW w:type="dxa" w:w="3733"/>
+          </w:tcPr>
+          <w:p/>
+        </w:tc>
+        <w:tc>
+          <w:tcPr>
+            <w:tcW w:type="dxa" w:w="1866"/>
+          </w:tcPr>
+          <w:p/>
+        </w:tc>
+      </w:tr>
+    </w:tbl>
+    <w:p/>
+    <w:p>
+      <w:pPr>
+        <w:keepNext/>
+        <w:jc w:val="center"/>
+        <w:rPr>
+          <w:rFonts w:ascii="Vidaloka" w:eastAsia="Vidaloka" w:hAnsi="Vidaloka" w:cs="Vidaloka"/>
+          <w:b/>
+          <w:bCs/>
+          <w:sz w:val="28"/>
+          <w:szCs w:val="28"/>
+        </w:rPr>
+      </w:pPr>
+      <w:r>
+        <w:rPr>
+          <w:rFonts w:ascii="Vidaloka" w:eastAsia="Vidaloka" w:hAnsi="Vidaloka" w:cs="Vidaloka"/>
+          <w:b/>
+          <w:bCs/>
+          <w:sz w:val="24"/>
+          <w:szCs w:val="28"/>
+        </w:rPr>
+        <w:t>Class (at least 1):</w:t>
+      </w:r>
+    </w:p>
+    <w:tbl>
+      <w:tblPr>
+        <w:tblStyle w:val="a"/>
+        <w:tblW w:w="9800" w:type="dxa"/>
+        <w:jc w:val="center"/>
+        <w:tblInd w:w="0" w:type="dxa"/>
+        <w:tblBorders>
+          <w:top w:val="single" w:sz="8" w:space="0" w:color="000000"/>
+          <w:left w:val="single" w:sz="8" w:space="0" w:color="000000"/>
+          <w:bottom w:val="single" w:sz="8" w:space="0" w:color="000000"/>
+          <w:right w:val="single" w:sz="8" w:space="0" w:color="000000"/>
+          <w:insideH w:val="single" w:sz="8" w:space="0" w:color="000000"/>
+          <w:insideV w:val="single" w:sz="8" w:space="0" w:color="000000"/>
+        </w:tblBorders>
+        <w:tblLayout w:type="fixed"/>
+        <w:tblLook w:val="0600" w:firstRow="0" w:lastRow="0" w:firstColumn="0" w:lastColumn="0" w:noHBand="1" w:noVBand="1"/>
+      </w:tblPr>
+      <w:tblGrid>
+        <w:gridCol w:w="3120"/>
+        <w:gridCol w:w="3120"/>
+        <w:gridCol w:w="3120"/>
+      </w:tblGrid>
+      <w:tr>
+        <w:trPr>
+          <w:cantSplit/>
+        </w:trPr>
+        <w:tc>
+          <w:tcPr>
+            <w:tcW w:type="dxa" w:w="1960"/>
+          </w:tcPr>
+          <w:p>
+            <w:pPr>
+              <w:keepNext/>
+            </w:pPr>
+            <w:r>
+              <w:rPr>
+                <w:rFonts w:ascii="Vidaloka" w:hAnsi="Vidaloka"/>
+                <w:b/>
+                <w:sz w:val="24"/>
+              </w:rPr>
+              <w:t>Class name</w:t>
+            </w:r>
+          </w:p>
+        </w:tc>
+        <w:tc>
+          <w:tcPr>
+            <w:tcW w:type="dxa" w:w="3920"/>
+          </w:tcPr>
+          <w:p>
+            <w:pPr>
+              <w:keepNext/>
+            </w:pPr>
+            <w:r>
+              <w:rPr>
+                <w:rFonts w:ascii="Vidaloka" w:hAnsi="Vidaloka"/>
+                <w:b/>
+                <w:sz w:val="24"/>
+              </w:rPr>
+              <w:t>Attributes</w:t>
+            </w:r>
+          </w:p>
+        </w:tc>
+        <w:tc>
+          <w:tcPr>
+            <w:tcW w:type="dxa" w:w="3920"/>
+          </w:tcPr>
+          <w:p>
+            <w:pPr>
+              <w:keepNext/>
+            </w:pPr>
+            <w:r>
+              <w:rPr>
+                <w:rFonts w:ascii="Vidaloka" w:hAnsi="Vidaloka"/>
+                <w:b/>
+                <w:sz w:val="24"/>
+              </w:rPr>
+              <w:t>Methods</w:t>
+            </w:r>
+          </w:p>
+        </w:tc>
+      </w:tr>
+      <w:tr>
+        <w:trPr>
+          <w:cantSplit/>
+        </w:trPr>
+        <w:tc>
+          <w:tcPr>
+            <w:tcW w:type="dxa" w:w="1960"/>
+          </w:tcPr>
+          <w:p>
+            <w:pPr>
+              <w:keepNext/>
+            </w:pPr>
+            <w:r>
+              <w:rPr>
+                <w:rFonts w:ascii="Nunito" w:hAnsi="Nunito"/>
+                <w:i/>
+                <w:color w:val="808080"/>
+                <w:sz w:val="20"/>
+              </w:rPr>
+              <w:t>Item</w:t>
+            </w:r>
+          </w:p>
+        </w:tc>
+        <w:tc>
+          <w:tcPr>
+            <w:tcW w:type="dxa" w:w="3920"/>
+          </w:tcPr>
+          <w:p>
+            <w:pPr>
+              <w:keepNext/>
+            </w:pPr>
+            <w:r>
+              <w:rPr>
+                <w:rFonts w:ascii="Nunito" w:hAnsi="Nunito"/>
+                <w:i/>
+                <w:color w:val="808080"/>
+                <w:sz w:val="20"/>
+              </w:rPr>
+              <w:t>name, quantity, unit_price</w:t>
+            </w:r>
+          </w:p>
+        </w:tc>
+        <w:tc>
+          <w:tcPr>
+            <w:tcW w:type="dxa" w:w="3920"/>
+          </w:tcPr>
+          <w:p>
+            <w:pPr>
+              <w:keepNext/>
+            </w:pPr>
+            <w:r>
+              <w:rPr>
+                <w:rFonts w:ascii="Nunito" w:hAnsi="Nunito"/>
+                <w:i/>
+                <w:color w:val="808080"/>
+                <w:sz w:val="20"/>
+              </w:rPr>
+              <w:t>total_value(), is_low_stock()</w:t>
+            </w:r>
+          </w:p>
+        </w:tc>
+      </w:tr>
+      <w:tr>
+        <w:trPr>
+          <w:cantSplit/>
+        </w:trPr>
+        <w:tc>
+          <w:tcPr>
+            <w:tcW w:type="dxa" w:w="1960"/>
+          </w:tcPr>
+          <w:p/>
+        </w:tc>
+        <w:tc>
+          <w:tcPr>
+            <w:tcW w:type="dxa" w:w="3920"/>
+          </w:tcPr>
+          <w:p/>
+        </w:tc>
+        <w:tc>
+          <w:tcPr>
+            <w:tcW w:type="dxa" w:w="3920"/>
+          </w:tcPr>
+          <w:p/>
+        </w:tc>
+      </w:tr>
+    </w:tbl>
+    <w:p/>
+    <w:p>
+      <w:pPr>
+        <w:keepNext/>
+        <w:jc w:val="center"/>
+        <w:rPr>
+          <w:rFonts w:ascii="Vidaloka" w:eastAsia="Vidaloka" w:hAnsi="Vidaloka" w:cs="Vidaloka"/>
+          <w:b/>
+          <w:bCs/>
+          <w:sz w:val="28"/>
+          <w:szCs w:val="28"/>
+        </w:rPr>
+      </w:pPr>
+      <w:r>
+        <w:rPr>
+          <w:rFonts w:ascii="Vidaloka" w:eastAsia="Vidaloka" w:hAnsi="Vidaloka" w:cs="Vidaloka"/>
+          <w:b/>
+          <w:bCs/>
+          <w:sz w:val="24"/>
+          <w:szCs w:val="28"/>
+        </w:rPr>
+        <w:t>Variables and data:</w:t>
+      </w:r>
+    </w:p>
+    <w:tbl>
+      <w:tblPr>
+        <w:tblStyle w:val="a"/>
+        <w:tblW w:w="9800" w:type="dxa"/>
+        <w:jc w:val="center"/>
+        <w:tblInd w:w="0" w:type="dxa"/>
+        <w:tblBorders>
+          <w:top w:val="single" w:sz="8" w:space="0" w:color="000000"/>
+          <w:left w:val="single" w:sz="8" w:space="0" w:color="000000"/>
+          <w:bottom w:val="single" w:sz="8" w:space="0" w:color="000000"/>
+          <w:right w:val="single" w:sz="8" w:space="0" w:color="000000"/>
+          <w:insideH w:val="single" w:sz="8" w:space="0" w:color="000000"/>
+          <w:insideV w:val="single" w:sz="8" w:space="0" w:color="000000"/>
+        </w:tblBorders>
+        <w:tblLayout w:type="fixed"/>
+        <w:tblLook w:val="0600" w:firstRow="0" w:lastRow="0" w:firstColumn="0" w:lastColumn="0" w:noHBand="1" w:noVBand="1"/>
+      </w:tblPr>
+      <w:tblGrid>
+        <w:gridCol w:w="3120"/>
+        <w:gridCol w:w="3120"/>
+        <w:gridCol w:w="3120"/>
+      </w:tblGrid>
+      <w:tr>
+        <w:trPr>
+          <w:cantSplit/>
+        </w:trPr>
+        <w:tc>
+          <w:tcPr>
+            <w:tcW w:type="dxa" w:w="2450"/>
+          </w:tcPr>
+          <w:p>
+            <w:pPr>
+              <w:keepNext/>
+            </w:pPr>
+            <w:r>
+              <w:rPr>
+                <w:rFonts w:ascii="Vidaloka" w:hAnsi="Vidaloka"/>
+                <w:b/>
+                <w:sz w:val="24"/>
+              </w:rPr>
+              <w:t>Name</w:t>
+            </w:r>
+          </w:p>
+        </w:tc>
+        <w:tc>
+          <w:tcPr>
+            <w:tcW w:type="dxa" w:w="1960"/>
+          </w:tcPr>
+          <w:p>
+            <w:pPr>
+              <w:keepNext/>
+            </w:pPr>
+            <w:r>
+              <w:rPr>
+                <w:rFonts w:ascii="Vidaloka" w:hAnsi="Vidaloka"/>
+                <w:b/>
+                <w:sz w:val="24"/>
+              </w:rPr>
+              <w:t>Type</w:t>
+            </w:r>
+          </w:p>
+        </w:tc>
+        <w:tc>
+          <w:tcPr>
+            <w:tcW w:type="dxa" w:w="5390"/>
+          </w:tcPr>
+          <w:p>
+            <w:pPr>
+              <w:keepNext/>
+            </w:pPr>
+            <w:r>
+              <w:rPr>
+                <w:rFonts w:ascii="Vidaloka" w:hAnsi="Vidaloka"/>
+                <w:b/>
+                <w:sz w:val="24"/>
+              </w:rPr>
+              <w:t>What it stores</w:t>
+            </w:r>
+          </w:p>
+        </w:tc>
+      </w:tr>
+      <w:tr>
+        <w:trPr>
+          <w:cantSplit/>
+        </w:trPr>
+        <w:tc>
+          <w:tcPr>
+            <w:tcW w:type="dxa" w:w="2450"/>
+          </w:tcPr>
+          <w:p>
+            <w:pPr>
+              <w:keepNext/>
+            </w:pPr>
+            <w:r>
+              <w:rPr>
+                <w:rFonts w:ascii="Nunito" w:hAnsi="Nunito"/>
+                <w:i/>
+                <w:color w:val="808080"/>
+                <w:sz w:val="20"/>
+              </w:rPr>
+              <w:t>inventory</w:t>
+            </w:r>
+          </w:p>
+        </w:tc>
+        <w:tc>
+          <w:tcPr>
+            <w:tcW w:type="dxa" w:w="1960"/>
+          </w:tcPr>
+          <w:p>
+            <w:pPr>
+              <w:keepNext/>
+            </w:pPr>
+            <w:r>
+              <w:rPr>
+                <w:rFonts w:ascii="Nunito" w:hAnsi="Nunito"/>
+                <w:i/>
+                <w:color w:val="808080"/>
+                <w:sz w:val="20"/>
+              </w:rPr>
+              <w:t>dictionary</w:t>
+            </w:r>
+          </w:p>
+        </w:tc>
+        <w:tc>
+          <w:tcPr>
+            <w:tcW w:type="dxa" w:w="5390"/>
+          </w:tcPr>
+          <w:p>
+            <w:pPr>
+              <w:keepNext/>
+            </w:pPr>
+            <w:r>
+              <w:rPr>
+                <w:rFonts w:ascii="Nunito" w:hAnsi="Nunito"/>
+                <w:i/>
+                <w:color w:val="808080"/>
+                <w:sz w:val="20"/>
+              </w:rPr>
+              <w:t>Item name → Item object</w:t>
+            </w:r>
+          </w:p>
+        </w:tc>
+      </w:tr>
+      <w:tr>
+        <w:trPr>
+          <w:cantSplit/>
+        </w:trPr>
+        <w:tc>
+          <w:tcPr>
+            <w:tcW w:type="dxa" w:w="2450"/>
+          </w:tcPr>
+          <w:p>
+            <w:pPr>
+              <w:keepNext/>
+            </w:pPr>
+          </w:p>
+        </w:tc>
+        <w:tc>
+          <w:tcPr>
+            <w:tcW w:type="dxa" w:w="1960"/>
+          </w:tcPr>
+          <w:p>
+            <w:pPr>
+              <w:keepNext/>
+            </w:pPr>
+          </w:p>
+        </w:tc>
+        <w:tc>
+          <w:tcPr>
+            <w:tcW w:type="dxa" w:w="5390"/>
+          </w:tcPr>
+          <w:p>
+            <w:pPr>
+              <w:keepNext/>
+            </w:pPr>
+          </w:p>
+        </w:tc>
+      </w:tr>
+      <w:tr>
+        <w:trPr>
+          <w:cantSplit/>
+        </w:trPr>
+        <w:tc>
+          <w:tcPr>
+            <w:tcW w:type="dxa" w:w="2450"/>
+          </w:tcPr>
+          <w:p>
+            <w:pPr>
+              <w:keepNext/>
+            </w:pPr>
+          </w:p>
+        </w:tc>
+        <w:tc>
+          <w:tcPr>
+            <w:tcW w:type="dxa" w:w="1960"/>
+          </w:tcPr>
+          <w:p>
+            <w:pPr>
+              <w:keepNext/>
+            </w:pPr>
+          </w:p>
+        </w:tc>
+        <w:tc>
+          <w:tcPr>
+            <w:tcW w:type="dxa" w:w="5390"/>
+          </w:tcPr>
+          <w:p>
+            <w:pPr>
+              <w:keepNext/>
+            </w:pPr>
+          </w:p>
+        </w:tc>
+      </w:tr>
+      <w:tr>
+        <w:trPr>
+          <w:cantSplit/>
+        </w:trPr>
+        <w:tc>
+          <w:tcPr>
+            <w:tcW w:type="dxa" w:w="2450"/>
+          </w:tcPr>
+          <w:p>
+            <w:pPr>
+              <w:keepNext/>
+            </w:pPr>
+          </w:p>
+        </w:tc>
+        <w:tc>
+          <w:tcPr>
+            <w:tcW w:type="dxa" w:w="1960"/>
+          </w:tcPr>
+          <w:p>
+            <w:pPr>
+              <w:keepNext/>
+            </w:pPr>
+          </w:p>
+        </w:tc>
+        <w:tc>
+          <w:tcPr>
+            <w:tcW w:type="dxa" w:w="5390"/>
+          </w:tcPr>
+          <w:p>
+            <w:pPr>
+              <w:keepNext/>
+            </w:pPr>
+          </w:p>
+        </w:tc>
+      </w:tr>
+      <w:tr>
+        <w:trPr>
+          <w:cantSplit/>
+        </w:trPr>
+        <w:tc>
+          <w:tcPr>
+            <w:tcW w:type="dxa" w:w="2450"/>
+          </w:tcPr>
+          <w:p/>
+        </w:tc>
+        <w:tc>
+          <w:tcPr>
+            <w:tcW w:type="dxa" w:w="1960"/>
+          </w:tcPr>
+          <w:p/>
+        </w:tc>
+        <w:tc>
+          <w:tcPr>
+            <w:tcW w:type="dxa" w:w="5390"/>
+          </w:tcPr>
+          <w:p/>
+        </w:tc>
+      </w:tr>
+    </w:tbl>
+    <w:p/>
+    <w:p>
+      <w:pPr>
+        <w:keepNext/>
+        <w:jc w:val="center"/>
+        <w:rPr>
+          <w:rFonts w:ascii="Vidaloka" w:eastAsia="Vidaloka" w:hAnsi="Vidaloka" w:cs="Vidaloka"/>
+          <w:b/>
+          <w:bCs/>
+          <w:sz w:val="28"/>
+          <w:szCs w:val="28"/>
+        </w:rPr>
+      </w:pPr>
+      <w:r>
+        <w:rPr>
+          <w:rFonts w:ascii="Vidaloka" w:eastAsia="Vidaloka" w:hAnsi="Vidaloka" w:cs="Vidaloka"/>
+          <w:b/>
+          <w:bCs/>
+          <w:sz w:val="24"/>
+          <w:szCs w:val="28"/>
+        </w:rPr>
+        <w:t>Files:</w:t>
+      </w:r>
+    </w:p>
+    <w:tbl>
+      <w:tblPr>
+        <w:tblStyle w:val="a"/>
+        <w:tblW w:w="9800" w:type="dxa"/>
+        <w:jc w:val="center"/>
+        <w:tblInd w:w="0" w:type="dxa"/>
+        <w:tblBorders>
+          <w:top w:val="single" w:sz="8" w:space="0" w:color="000000"/>
+          <w:left w:val="single" w:sz="8" w:space="0" w:color="000000"/>
+          <w:bottom w:val="single" w:sz="8" w:space="0" w:color="000000"/>
+          <w:right w:val="single" w:sz="8" w:space="0" w:color="000000"/>
+          <w:insideH w:val="single" w:sz="8" w:space="0" w:color="000000"/>
+          <w:insideV w:val="single" w:sz="8" w:space="0" w:color="000000"/>
+        </w:tblBorders>
+        <w:tblLayout w:type="fixed"/>
+        <w:tblLook w:val="0600" w:firstRow="0" w:lastRow="0" w:firstColumn="0" w:lastColumn="0" w:noHBand="1" w:noVBand="1"/>
+      </w:tblPr>
+      <w:tblGrid>
+        <w:gridCol w:w="3120"/>
+        <w:gridCol w:w="3120"/>
+        <w:gridCol w:w="3120"/>
+      </w:tblGrid>
+      <w:tr>
+        <w:trPr>
+          <w:cantSplit/>
+        </w:trPr>
+        <w:tc>
+          <w:tcPr>
+            <w:tcW w:type="dxa" w:w="2450"/>
+          </w:tcPr>
+          <w:p>
+            <w:pPr>
+              <w:keepNext/>
+            </w:pPr>
+            <w:r>
+              <w:rPr>
+                <w:rFonts w:ascii="Vidaloka" w:hAnsi="Vidaloka"/>
+                <w:b/>
+                <w:sz w:val="24"/>
+              </w:rPr>
+              <w:t>File name</w:t>
+            </w:r>
+          </w:p>
+        </w:tc>
+        <w:tc>
+          <w:tcPr>
+            <w:tcW w:type="dxa" w:w="2450"/>
+          </w:tcPr>
+          <w:p>
+            <w:pPr>
+              <w:keepNext/>
+            </w:pPr>
+            <w:r>
+              <w:rPr>
+                <w:rFonts w:ascii="Vidaloka" w:hAnsi="Vidaloka"/>
+                <w:b/>
+                <w:sz w:val="24"/>
+              </w:rPr>
+              <w:t>Read, write, or both</w:t>
+            </w:r>
+          </w:p>
+        </w:tc>
+        <w:tc>
+          <w:tcPr>
+            <w:tcW w:type="dxa" w:w="4900"/>
+          </w:tcPr>
+          <w:p>
+            <w:pPr>
+              <w:keepNext/>
+            </w:pPr>
+            <w:r>
+              <w:rPr>
+                <w:rFonts w:ascii="Vidaloka" w:hAnsi="Vidaloka"/>
+                <w:b/>
+                <w:sz w:val="24"/>
+              </w:rPr>
+              <w:t>What is in it</w:t>
+            </w:r>
+          </w:p>
+        </w:tc>
+      </w:tr>
+      <w:tr>
+        <w:trPr>
+          <w:cantSplit/>
+        </w:trPr>
+        <w:tc>
+          <w:tcPr>
+            <w:tcW w:type="dxa" w:w="2450"/>
+          </w:tcPr>
+          <w:p>
+            <w:pPr>
+              <w:keepNext/>
+            </w:pPr>
+            <w:r>
+              <w:rPr>
+                <w:rFonts w:ascii="Nunito" w:hAnsi="Nunito"/>
+                <w:i/>
+                <w:color w:val="808080"/>
+                <w:sz w:val="20"/>
+              </w:rPr>
+              <w:t>inventory.csv</w:t>
+            </w:r>
+          </w:p>
+        </w:tc>
+        <w:tc>
+          <w:tcPr>
+            <w:tcW w:type="dxa" w:w="2450"/>
+          </w:tcPr>
+          <w:p>
+            <w:pPr>
+              <w:keepNext/>
+            </w:pPr>
+            <w:r>
+              <w:rPr>
+                <w:rFonts w:ascii="Nunito" w:hAnsi="Nunito"/>
+                <w:i/>
+                <w:color w:val="808080"/>
+                <w:sz w:val="20"/>
+              </w:rPr>
+              <w:t>Both</w:t>
+            </w:r>
+          </w:p>
+        </w:tc>
+        <w:tc>
+          <w:tcPr>
+            <w:tcW w:type="dxa" w:w="4900"/>
+          </w:tcPr>
+          <w:p>
+            <w:pPr>
+              <w:keepNext/>
+            </w:pPr>
+            <w:r>
+              <w:rPr>
+                <w:rFonts w:ascii="Nunito" w:hAnsi="Nunito"/>
+                <w:i/>
+                <w:color w:val="808080"/>
+                <w:sz w:val="20"/>
+              </w:rPr>
+              <w:t>One row per item: name, quantity, price</w:t>
+            </w:r>
+          </w:p>
+        </w:tc>
+      </w:tr>
+      <w:tr>
+        <w:trPr>
+          <w:cantSplit/>
+        </w:trPr>
+        <w:tc>
+          <w:tcPr>
+            <w:tcW w:type="dxa" w:w="2450"/>
+          </w:tcPr>
+          <w:p/>
+        </w:tc>
+        <w:tc>
+          <w:tcPr>
+            <w:tcW w:type="dxa" w:w="2450"/>
+          </w:tcPr>
+          <w:p/>
+        </w:tc>
+        <w:tc>
+          <w:tcPr>
+            <w:tcW w:type="dxa" w:w="4900"/>
+          </w:tcPr>
+          <w:p/>
+        </w:tc>
+      </w:tr>
+    </w:tbl>
+    <w:p/>
     <w:p>
       <w:pPr>
         <w:jc w:val="center"/>

</xml_diff>

<commit_message>
Add pseudo code section to proposal doc
</commit_message>
<xml_diff>
--- a/docs/unit2/07_unit2_project/HW-Project-2-Pseudocode.docx
+++ b/docs/unit2/07_unit2_project/HW-Project-2-Pseudocode.docx
@@ -1,6 +1,6 @@
 
 <file path=word/document.xml><?xml version="1.0" encoding="utf-8"?>
-<w:document xmlns:wpc="http://schemas.microsoft.com/office/word/2010/wordprocessingCanvas" xmlns:cx="http://schemas.microsoft.com/office/drawing/2014/chartex" xmlns:cx1="http://schemas.microsoft.com/office/drawing/2015/9/8/chartex" xmlns:cx2="http://schemas.microsoft.com/office/drawing/2015/10/21/chartex" xmlns:cx3="http://schemas.microsoft.com/office/drawing/2016/5/9/chartex" xmlns:cx4="http://schemas.microsoft.com/office/drawing/2016/5/10/chartex" xmlns:cx5="http://schemas.microsoft.com/office/drawing/2016/5/11/chartex" xmlns:cx6="http://schemas.microsoft.com/office/drawing/2016/5/12/chartex" xmlns:cx7="http://schemas.microsoft.com/office/drawing/2016/5/13/chartex" xmlns:cx8="http://schemas.microsoft.com/office/drawing/2016/5/14/chartex" xmlns:mc="http://schemas.openxmlformats.org/markup-compatibility/2006" xmlns:aink="http://schemas.microsoft.com/office/drawing/2016/ink" xmlns:am3d="http://schemas.microsoft.com/office/drawing/2017/model3d" xmlns:o="urn:schemas-microsoft-com:office:office" xmlns:r="http://schemas.openxmlformats.org/officeDocument/2006/relationships" xmlns:m="http://schemas.openxmlformats.org/officeDocument/2006/math" xmlns:v="urn:schemas-microsoft-com:vml" xmlns:wp14="http://schemas.microsoft.com/office/word/2010/wordprocessingDrawing" xmlns:wp="http://schemas.openxmlformats.org/drawingml/2006/wordprocessingDrawing" xmlns:w10="urn:schemas-microsoft-com:office:word" xmlns:w="http://schemas.openxmlformats.org/wordprocessingml/2006/main" xmlns:w14="http://schemas.microsoft.com/office/word/2010/wordml" xmlns:w15="http://schemas.microsoft.com/office/word/2012/wordml" xmlns:w16cex="http://schemas.microsoft.com/office/word/2018/wordml/cex" xmlns:w16cid="http://schemas.microsoft.com/office/word/2016/wordml/cid" xmlns:w16="http://schemas.microsoft.com/office/word/2018/wordml" xmlns:w16sdtdh="http://schemas.microsoft.com/office/word/2020/wordml/sdtdatahash" xmlns:w16se="http://schemas.microsoft.com/office/word/2015/wordml/symex" xmlns:wpg="http://schemas.microsoft.com/office/word/2010/wordprocessingGroup" xmlns:wpi="http://schemas.microsoft.com/office/word/2010/wordprocessingInk" xmlns:wne="http://schemas.microsoft.com/office/word/2006/wordml" xmlns:wps="http://schemas.microsoft.com/office/word/2010/wordprocessingShape" mc:Ignorable="w14 w15 w16se w16cid w16 w16cex w16sdtdh wp14">
+<w:document xmlns:wpc="http://schemas.microsoft.com/office/word/2010/wordprocessingCanvas" xmlns:cx="http://schemas.microsoft.com/office/drawing/2014/chartex" xmlns:cx1="http://schemas.microsoft.com/office/drawing/2015/9/8/chartex" xmlns:cx2="http://schemas.microsoft.com/office/drawing/2015/10/21/chartex" xmlns:cx3="http://schemas.microsoft.com/office/drawing/2016/5/9/chartex" xmlns:cx4="http://schemas.microsoft.com/office/drawing/2016/5/10/chartex" xmlns:cx5="http://schemas.microsoft.com/office/drawing/2016/5/11/chartex" xmlns:cx6="http://schemas.microsoft.com/office/drawing/2016/5/12/chartex" xmlns:cx7="http://schemas.microsoft.com/office/drawing/2016/5/13/chartex" xmlns:cx8="http://schemas.microsoft.com/office/drawing/2016/5/14/chartex" xmlns:mc="http://schemas.openxmlformats.org/markup-compatibility/2006" xmlns:aink="http://schemas.microsoft.com/office/drawing/2016/ink" xmlns:am3d="http://schemas.microsoft.com/office/drawing/2017/model3d" xmlns:o="urn:schemas-microsoft-com:office:office" xmlns:oel="http://schemas.microsoft.com/office/2019/extlst" xmlns:r="http://schemas.openxmlformats.org/officeDocument/2006/relationships" xmlns:m="http://schemas.openxmlformats.org/officeDocument/2006/math" xmlns:v="urn:schemas-microsoft-com:vml" xmlns:wp14="http://schemas.microsoft.com/office/word/2010/wordprocessingDrawing" xmlns:wp="http://schemas.openxmlformats.org/drawingml/2006/wordprocessingDrawing" xmlns:w10="urn:schemas-microsoft-com:office:word" xmlns:w="http://schemas.openxmlformats.org/wordprocessingml/2006/main" xmlns:w14="http://schemas.microsoft.com/office/word/2010/wordml" xmlns:w15="http://schemas.microsoft.com/office/word/2012/wordml" xmlns:w16cex="http://schemas.microsoft.com/office/word/2018/wordml/cex" xmlns:w16cid="http://schemas.microsoft.com/office/word/2016/wordml/cid" xmlns:w16="http://schemas.microsoft.com/office/word/2018/wordml" xmlns:w16du="http://schemas.microsoft.com/office/word/2023/wordml/word16du" xmlns:w16sdtdh="http://schemas.microsoft.com/office/word/2020/wordml/sdtdatahash" xmlns:w16sdtfl="http://schemas.microsoft.com/office/word/2024/wordml/sdtformatlock" xmlns:w16se="http://schemas.microsoft.com/office/word/2015/wordml/symex" xmlns:wpg="http://schemas.microsoft.com/office/word/2010/wordprocessingGroup" xmlns:wpi="http://schemas.microsoft.com/office/word/2010/wordprocessingInk" xmlns:wne="http://schemas.microsoft.com/office/word/2006/wordml" xmlns:wps="http://schemas.microsoft.com/office/word/2010/wordprocessingShape" mc:Ignorable="w14 w15 w16se w16cid w16 w16cex w16sdtdh w16sdtfl w16du wp14">
   <w:body>
     <w:p>
       <w:pPr>
@@ -75,10 +75,44 @@
           <w:sz w:val="28"/>
           <w:szCs w:val="28"/>
         </w:rPr>
-        <w:t xml:space="preserve">How is your team going about </w:t>
+        <w:t>How is your team going about it:</w:t>
       </w:r>
-      <w:proofErr w:type="gramStart"/>
+    </w:p>
+    <w:p>
+      <w:pPr>
+        <w:jc w:val="center"/>
+        <w:rPr>
+          <w:rFonts w:ascii="Vidaloka" w:eastAsia="Vidaloka" w:hAnsi="Vidaloka" w:cs="Vidaloka"/>
+          <w:sz w:val="28"/>
+          <w:szCs w:val="28"/>
+        </w:rPr>
+      </w:pPr>
+    </w:p>
+    <w:p>
+      <w:pPr>
+        <w:ind w:firstLine="720"/>
+        <w:rPr>
+          <w:rFonts w:ascii="Nunito" w:eastAsia="Nunito" w:hAnsi="Nunito" w:cs="Nunito"/>
+        </w:rPr>
+      </w:pPr>
       <w:r>
+        <w:rPr>
+          <w:rFonts w:ascii="Nunito" w:eastAsia="Nunito" w:hAnsi="Nunito" w:cs="Nunito"/>
+        </w:rPr>
+        <w:t>Type your response here</w:t>
+      </w:r>
+    </w:p>
+    <w:p>
+      <w:pPr>
+        <w:ind w:firstLine="720"/>
+        <w:rPr>
+          <w:rFonts w:ascii="Nunito" w:eastAsia="Nunito" w:hAnsi="Nunito" w:cs="Nunito"/>
+        </w:rPr>
+      </w:pPr>
+    </w:p>
+    <w:p>
+      <w:pPr>
+        <w:jc w:val="center"/>
         <w:rPr>
           <w:rFonts w:ascii="Vidaloka" w:eastAsia="Vidaloka" w:hAnsi="Vidaloka" w:cs="Vidaloka"/>
           <w:b/>
@@ -86,19 +120,17 @@
           <w:sz w:val="28"/>
           <w:szCs w:val="28"/>
         </w:rPr>
-        <w:t>it:</w:t>
-      </w:r>
-      <w:proofErr w:type="gramEnd"/>
-    </w:p>
-    <w:p>
-      <w:pPr>
-        <w:jc w:val="center"/>
+      </w:pPr>
+      <w:r>
         <w:rPr>
           <w:rFonts w:ascii="Vidaloka" w:eastAsia="Vidaloka" w:hAnsi="Vidaloka" w:cs="Vidaloka"/>
+          <w:b/>
+          <w:bCs/>
           <w:sz w:val="28"/>
           <w:szCs w:val="28"/>
         </w:rPr>
-      </w:pPr>
+        <w:t>Pseudo Code:</w:t>
+      </w:r>
     </w:p>
     <w:p>
       <w:pPr>
@@ -196,18 +228,19 @@
         <w:tblLook w:val="0600" w:firstRow="0" w:lastRow="0" w:firstColumn="0" w:lastColumn="0" w:noHBand="1" w:noVBand="1"/>
       </w:tblPr>
       <w:tblGrid>
-        <w:gridCol w:w="2340"/>
-        <w:gridCol w:w="2340"/>
-        <w:gridCol w:w="2340"/>
-        <w:gridCol w:w="2340"/>
+        <w:gridCol w:w="1867"/>
+        <w:gridCol w:w="2333"/>
+        <w:gridCol w:w="3734"/>
+        <w:gridCol w:w="1866"/>
       </w:tblGrid>
       <w:tr>
         <w:trPr>
           <w:cantSplit/>
+          <w:jc w:val="center"/>
         </w:trPr>
         <w:tc>
           <w:tcPr>
-            <w:tcW w:type="dxa" w:w="1866"/>
+            <w:tcW w:w="1866" w:type="dxa"/>
           </w:tcPr>
           <w:p>
             <w:pPr>
@@ -225,7 +258,7 @@
         </w:tc>
         <w:tc>
           <w:tcPr>
-            <w:tcW w:type="dxa" w:w="2333"/>
+            <w:tcW w:w="2333" w:type="dxa"/>
           </w:tcPr>
           <w:p>
             <w:pPr>
@@ -243,7 +276,7 @@
         </w:tc>
         <w:tc>
           <w:tcPr>
-            <w:tcW w:type="dxa" w:w="3733"/>
+            <w:tcW w:w="3733" w:type="dxa"/>
           </w:tcPr>
           <w:p>
             <w:pPr>
@@ -261,7 +294,7 @@
         </w:tc>
         <w:tc>
           <w:tcPr>
-            <w:tcW w:type="dxa" w:w="1866"/>
+            <w:tcW w:w="1866" w:type="dxa"/>
           </w:tcPr>
           <w:p>
             <w:pPr>
@@ -281,10 +314,11 @@
       <w:tr>
         <w:trPr>
           <w:cantSplit/>
+          <w:jc w:val="center"/>
         </w:trPr>
         <w:tc>
           <w:tcPr>
-            <w:tcW w:type="dxa" w:w="1866"/>
+            <w:tcW w:w="1866" w:type="dxa"/>
           </w:tcPr>
           <w:p>
             <w:pPr>
@@ -303,7 +337,7 @@
         </w:tc>
         <w:tc>
           <w:tcPr>
-            <w:tcW w:type="dxa" w:w="2333"/>
+            <w:tcW w:w="2333" w:type="dxa"/>
           </w:tcPr>
           <w:p>
             <w:pPr>
@@ -322,7 +356,7 @@
         </w:tc>
         <w:tc>
           <w:tcPr>
-            <w:tcW w:type="dxa" w:w="3733"/>
+            <w:tcW w:w="3733" w:type="dxa"/>
           </w:tcPr>
           <w:p>
             <w:pPr>
@@ -341,7 +375,7 @@
         </w:tc>
         <w:tc>
           <w:tcPr>
-            <w:tcW w:type="dxa" w:w="1866"/>
+            <w:tcW w:w="1866" w:type="dxa"/>
           </w:tcPr>
           <w:p>
             <w:pPr>
@@ -362,40 +396,41 @@
       <w:tr>
         <w:trPr>
           <w:cantSplit/>
+          <w:jc w:val="center"/>
         </w:trPr>
         <w:tc>
           <w:tcPr>
-            <w:tcW w:type="dxa" w:w="1866"/>
-          </w:tcPr>
-          <w:p>
-            <w:pPr>
-              <w:keepNext/>
-            </w:pPr>
-          </w:p>
-        </w:tc>
-        <w:tc>
-          <w:tcPr>
-            <w:tcW w:type="dxa" w:w="2333"/>
-          </w:tcPr>
-          <w:p>
-            <w:pPr>
-              <w:keepNext/>
-            </w:pPr>
-          </w:p>
-        </w:tc>
-        <w:tc>
-          <w:tcPr>
-            <w:tcW w:type="dxa" w:w="3733"/>
-          </w:tcPr>
-          <w:p>
-            <w:pPr>
-              <w:keepNext/>
-            </w:pPr>
-          </w:p>
-        </w:tc>
-        <w:tc>
-          <w:tcPr>
-            <w:tcW w:type="dxa" w:w="1866"/>
+            <w:tcW w:w="1866" w:type="dxa"/>
+          </w:tcPr>
+          <w:p>
+            <w:pPr>
+              <w:keepNext/>
+            </w:pPr>
+          </w:p>
+        </w:tc>
+        <w:tc>
+          <w:tcPr>
+            <w:tcW w:w="2333" w:type="dxa"/>
+          </w:tcPr>
+          <w:p>
+            <w:pPr>
+              <w:keepNext/>
+            </w:pPr>
+          </w:p>
+        </w:tc>
+        <w:tc>
+          <w:tcPr>
+            <w:tcW w:w="3733" w:type="dxa"/>
+          </w:tcPr>
+          <w:p>
+            <w:pPr>
+              <w:keepNext/>
+            </w:pPr>
+          </w:p>
+        </w:tc>
+        <w:tc>
+          <w:tcPr>
+            <w:tcW w:w="1866" w:type="dxa"/>
           </w:tcPr>
           <w:p>
             <w:pPr>
@@ -407,40 +442,41 @@
       <w:tr>
         <w:trPr>
           <w:cantSplit/>
+          <w:jc w:val="center"/>
         </w:trPr>
         <w:tc>
           <w:tcPr>
-            <w:tcW w:type="dxa" w:w="1866"/>
-          </w:tcPr>
-          <w:p>
-            <w:pPr>
-              <w:keepNext/>
-            </w:pPr>
-          </w:p>
-        </w:tc>
-        <w:tc>
-          <w:tcPr>
-            <w:tcW w:type="dxa" w:w="2333"/>
-          </w:tcPr>
-          <w:p>
-            <w:pPr>
-              <w:keepNext/>
-            </w:pPr>
-          </w:p>
-        </w:tc>
-        <w:tc>
-          <w:tcPr>
-            <w:tcW w:type="dxa" w:w="3733"/>
-          </w:tcPr>
-          <w:p>
-            <w:pPr>
-              <w:keepNext/>
-            </w:pPr>
-          </w:p>
-        </w:tc>
-        <w:tc>
-          <w:tcPr>
-            <w:tcW w:type="dxa" w:w="1866"/>
+            <w:tcW w:w="1866" w:type="dxa"/>
+          </w:tcPr>
+          <w:p>
+            <w:pPr>
+              <w:keepNext/>
+            </w:pPr>
+          </w:p>
+        </w:tc>
+        <w:tc>
+          <w:tcPr>
+            <w:tcW w:w="2333" w:type="dxa"/>
+          </w:tcPr>
+          <w:p>
+            <w:pPr>
+              <w:keepNext/>
+            </w:pPr>
+          </w:p>
+        </w:tc>
+        <w:tc>
+          <w:tcPr>
+            <w:tcW w:w="3733" w:type="dxa"/>
+          </w:tcPr>
+          <w:p>
+            <w:pPr>
+              <w:keepNext/>
+            </w:pPr>
+          </w:p>
+        </w:tc>
+        <w:tc>
+          <w:tcPr>
+            <w:tcW w:w="1866" w:type="dxa"/>
           </w:tcPr>
           <w:p>
             <w:pPr>
@@ -452,28 +488,29 @@
       <w:tr>
         <w:trPr>
           <w:cantSplit/>
+          <w:jc w:val="center"/>
         </w:trPr>
         <w:tc>
           <w:tcPr>
-            <w:tcW w:type="dxa" w:w="1866"/>
+            <w:tcW w:w="1866" w:type="dxa"/>
           </w:tcPr>
           <w:p/>
         </w:tc>
         <w:tc>
           <w:tcPr>
-            <w:tcW w:type="dxa" w:w="2333"/>
+            <w:tcW w:w="2333" w:type="dxa"/>
           </w:tcPr>
           <w:p/>
         </w:tc>
         <w:tc>
           <w:tcPr>
-            <w:tcW w:type="dxa" w:w="3733"/>
+            <w:tcW w:w="3733" w:type="dxa"/>
           </w:tcPr>
           <w:p/>
         </w:tc>
         <w:tc>
           <w:tcPr>
-            <w:tcW w:type="dxa" w:w="1866"/>
+            <w:tcW w:w="1866" w:type="dxa"/>
           </w:tcPr>
           <w:p/>
         </w:tc>
@@ -521,17 +558,18 @@
         <w:tblLook w:val="0600" w:firstRow="0" w:lastRow="0" w:firstColumn="0" w:lastColumn="0" w:noHBand="1" w:noVBand="1"/>
       </w:tblPr>
       <w:tblGrid>
-        <w:gridCol w:w="3120"/>
-        <w:gridCol w:w="3120"/>
-        <w:gridCol w:w="3120"/>
+        <w:gridCol w:w="1960"/>
+        <w:gridCol w:w="3920"/>
+        <w:gridCol w:w="3920"/>
       </w:tblGrid>
       <w:tr>
         <w:trPr>
           <w:cantSplit/>
+          <w:jc w:val="center"/>
         </w:trPr>
         <w:tc>
           <w:tcPr>
-            <w:tcW w:type="dxa" w:w="1960"/>
+            <w:tcW w:w="1960" w:type="dxa"/>
           </w:tcPr>
           <w:p>
             <w:pPr>
@@ -549,7 +587,7 @@
         </w:tc>
         <w:tc>
           <w:tcPr>
-            <w:tcW w:type="dxa" w:w="3920"/>
+            <w:tcW w:w="3920" w:type="dxa"/>
           </w:tcPr>
           <w:p>
             <w:pPr>
@@ -567,7 +605,7 @@
         </w:tc>
         <w:tc>
           <w:tcPr>
-            <w:tcW w:type="dxa" w:w="3920"/>
+            <w:tcW w:w="3920" w:type="dxa"/>
           </w:tcPr>
           <w:p>
             <w:pPr>
@@ -587,10 +625,11 @@
       <w:tr>
         <w:trPr>
           <w:cantSplit/>
+          <w:jc w:val="center"/>
         </w:trPr>
         <w:tc>
           <w:tcPr>
-            <w:tcW w:type="dxa" w:w="1960"/>
+            <w:tcW w:w="1960" w:type="dxa"/>
           </w:tcPr>
           <w:p>
             <w:pPr>
@@ -609,7 +648,7 @@
         </w:tc>
         <w:tc>
           <w:tcPr>
-            <w:tcW w:type="dxa" w:w="3920"/>
+            <w:tcW w:w="3920" w:type="dxa"/>
           </w:tcPr>
           <w:p>
             <w:pPr>
@@ -628,7 +667,7 @@
         </w:tc>
         <w:tc>
           <w:tcPr>
-            <w:tcW w:type="dxa" w:w="3920"/>
+            <w:tcW w:w="3920" w:type="dxa"/>
           </w:tcPr>
           <w:p>
             <w:pPr>
@@ -649,22 +688,23 @@
       <w:tr>
         <w:trPr>
           <w:cantSplit/>
+          <w:jc w:val="center"/>
         </w:trPr>
         <w:tc>
           <w:tcPr>
-            <w:tcW w:type="dxa" w:w="1960"/>
+            <w:tcW w:w="1960" w:type="dxa"/>
           </w:tcPr>
           <w:p/>
         </w:tc>
         <w:tc>
           <w:tcPr>
-            <w:tcW w:type="dxa" w:w="3920"/>
+            <w:tcW w:w="3920" w:type="dxa"/>
           </w:tcPr>
           <w:p/>
         </w:tc>
         <w:tc>
           <w:tcPr>
-            <w:tcW w:type="dxa" w:w="3920"/>
+            <w:tcW w:w="3920" w:type="dxa"/>
           </w:tcPr>
           <w:p/>
         </w:tc>
@@ -691,6 +731,7 @@
           <w:sz w:val="24"/>
           <w:szCs w:val="28"/>
         </w:rPr>
+        <w:lastRenderedPageBreak/>
         <w:t>Variables and data:</w:t>
       </w:r>
     </w:p>
@@ -712,17 +753,18 @@
         <w:tblLook w:val="0600" w:firstRow="0" w:lastRow="0" w:firstColumn="0" w:lastColumn="0" w:noHBand="1" w:noVBand="1"/>
       </w:tblPr>
       <w:tblGrid>
-        <w:gridCol w:w="3120"/>
-        <w:gridCol w:w="3120"/>
-        <w:gridCol w:w="3120"/>
+        <w:gridCol w:w="2450"/>
+        <w:gridCol w:w="1960"/>
+        <w:gridCol w:w="5390"/>
       </w:tblGrid>
       <w:tr>
         <w:trPr>
           <w:cantSplit/>
+          <w:jc w:val="center"/>
         </w:trPr>
         <w:tc>
           <w:tcPr>
-            <w:tcW w:type="dxa" w:w="2450"/>
+            <w:tcW w:w="2450" w:type="dxa"/>
           </w:tcPr>
           <w:p>
             <w:pPr>
@@ -740,7 +782,7 @@
         </w:tc>
         <w:tc>
           <w:tcPr>
-            <w:tcW w:type="dxa" w:w="1960"/>
+            <w:tcW w:w="1960" w:type="dxa"/>
           </w:tcPr>
           <w:p>
             <w:pPr>
@@ -758,7 +800,7 @@
         </w:tc>
         <w:tc>
           <w:tcPr>
-            <w:tcW w:type="dxa" w:w="5390"/>
+            <w:tcW w:w="5390" w:type="dxa"/>
           </w:tcPr>
           <w:p>
             <w:pPr>
@@ -778,10 +820,11 @@
       <w:tr>
         <w:trPr>
           <w:cantSplit/>
+          <w:jc w:val="center"/>
         </w:trPr>
         <w:tc>
           <w:tcPr>
-            <w:tcW w:type="dxa" w:w="2450"/>
+            <w:tcW w:w="2450" w:type="dxa"/>
           </w:tcPr>
           <w:p>
             <w:pPr>
@@ -800,7 +843,7 @@
         </w:tc>
         <w:tc>
           <w:tcPr>
-            <w:tcW w:type="dxa" w:w="1960"/>
+            <w:tcW w:w="1960" w:type="dxa"/>
           </w:tcPr>
           <w:p>
             <w:pPr>
@@ -819,7 +862,7 @@
         </w:tc>
         <w:tc>
           <w:tcPr>
-            <w:tcW w:type="dxa" w:w="5390"/>
+            <w:tcW w:w="5390" w:type="dxa"/>
           </w:tcPr>
           <w:p>
             <w:pPr>
@@ -840,30 +883,31 @@
       <w:tr>
         <w:trPr>
           <w:cantSplit/>
+          <w:jc w:val="center"/>
         </w:trPr>
         <w:tc>
           <w:tcPr>
-            <w:tcW w:type="dxa" w:w="2450"/>
-          </w:tcPr>
-          <w:p>
-            <w:pPr>
-              <w:keepNext/>
-            </w:pPr>
-          </w:p>
-        </w:tc>
-        <w:tc>
-          <w:tcPr>
-            <w:tcW w:type="dxa" w:w="1960"/>
-          </w:tcPr>
-          <w:p>
-            <w:pPr>
-              <w:keepNext/>
-            </w:pPr>
-          </w:p>
-        </w:tc>
-        <w:tc>
-          <w:tcPr>
-            <w:tcW w:type="dxa" w:w="5390"/>
+            <w:tcW w:w="2450" w:type="dxa"/>
+          </w:tcPr>
+          <w:p>
+            <w:pPr>
+              <w:keepNext/>
+            </w:pPr>
+          </w:p>
+        </w:tc>
+        <w:tc>
+          <w:tcPr>
+            <w:tcW w:w="1960" w:type="dxa"/>
+          </w:tcPr>
+          <w:p>
+            <w:pPr>
+              <w:keepNext/>
+            </w:pPr>
+          </w:p>
+        </w:tc>
+        <w:tc>
+          <w:tcPr>
+            <w:tcW w:w="5390" w:type="dxa"/>
           </w:tcPr>
           <w:p>
             <w:pPr>
@@ -875,30 +919,31 @@
       <w:tr>
         <w:trPr>
           <w:cantSplit/>
+          <w:jc w:val="center"/>
         </w:trPr>
         <w:tc>
           <w:tcPr>
-            <w:tcW w:type="dxa" w:w="2450"/>
-          </w:tcPr>
-          <w:p>
-            <w:pPr>
-              <w:keepNext/>
-            </w:pPr>
-          </w:p>
-        </w:tc>
-        <w:tc>
-          <w:tcPr>
-            <w:tcW w:type="dxa" w:w="1960"/>
-          </w:tcPr>
-          <w:p>
-            <w:pPr>
-              <w:keepNext/>
-            </w:pPr>
-          </w:p>
-        </w:tc>
-        <w:tc>
-          <w:tcPr>
-            <w:tcW w:type="dxa" w:w="5390"/>
+            <w:tcW w:w="2450" w:type="dxa"/>
+          </w:tcPr>
+          <w:p>
+            <w:pPr>
+              <w:keepNext/>
+            </w:pPr>
+          </w:p>
+        </w:tc>
+        <w:tc>
+          <w:tcPr>
+            <w:tcW w:w="1960" w:type="dxa"/>
+          </w:tcPr>
+          <w:p>
+            <w:pPr>
+              <w:keepNext/>
+            </w:pPr>
+          </w:p>
+        </w:tc>
+        <w:tc>
+          <w:tcPr>
+            <w:tcW w:w="5390" w:type="dxa"/>
           </w:tcPr>
           <w:p>
             <w:pPr>
@@ -910,30 +955,31 @@
       <w:tr>
         <w:trPr>
           <w:cantSplit/>
+          <w:jc w:val="center"/>
         </w:trPr>
         <w:tc>
           <w:tcPr>
-            <w:tcW w:type="dxa" w:w="2450"/>
-          </w:tcPr>
-          <w:p>
-            <w:pPr>
-              <w:keepNext/>
-            </w:pPr>
-          </w:p>
-        </w:tc>
-        <w:tc>
-          <w:tcPr>
-            <w:tcW w:type="dxa" w:w="1960"/>
-          </w:tcPr>
-          <w:p>
-            <w:pPr>
-              <w:keepNext/>
-            </w:pPr>
-          </w:p>
-        </w:tc>
-        <w:tc>
-          <w:tcPr>
-            <w:tcW w:type="dxa" w:w="5390"/>
+            <w:tcW w:w="2450" w:type="dxa"/>
+          </w:tcPr>
+          <w:p>
+            <w:pPr>
+              <w:keepNext/>
+            </w:pPr>
+          </w:p>
+        </w:tc>
+        <w:tc>
+          <w:tcPr>
+            <w:tcW w:w="1960" w:type="dxa"/>
+          </w:tcPr>
+          <w:p>
+            <w:pPr>
+              <w:keepNext/>
+            </w:pPr>
+          </w:p>
+        </w:tc>
+        <w:tc>
+          <w:tcPr>
+            <w:tcW w:w="5390" w:type="dxa"/>
           </w:tcPr>
           <w:p>
             <w:pPr>
@@ -945,22 +991,23 @@
       <w:tr>
         <w:trPr>
           <w:cantSplit/>
+          <w:jc w:val="center"/>
         </w:trPr>
         <w:tc>
           <w:tcPr>
-            <w:tcW w:type="dxa" w:w="2450"/>
+            <w:tcW w:w="2450" w:type="dxa"/>
           </w:tcPr>
           <w:p/>
         </w:tc>
         <w:tc>
           <w:tcPr>
-            <w:tcW w:type="dxa" w:w="1960"/>
+            <w:tcW w:w="1960" w:type="dxa"/>
           </w:tcPr>
           <w:p/>
         </w:tc>
         <w:tc>
           <w:tcPr>
-            <w:tcW w:type="dxa" w:w="5390"/>
+            <w:tcW w:w="5390" w:type="dxa"/>
           </w:tcPr>
           <w:p/>
         </w:tc>
@@ -1008,17 +1055,18 @@
         <w:tblLook w:val="0600" w:firstRow="0" w:lastRow="0" w:firstColumn="0" w:lastColumn="0" w:noHBand="1" w:noVBand="1"/>
       </w:tblPr>
       <w:tblGrid>
-        <w:gridCol w:w="3120"/>
-        <w:gridCol w:w="3120"/>
-        <w:gridCol w:w="3120"/>
+        <w:gridCol w:w="2450"/>
+        <w:gridCol w:w="2450"/>
+        <w:gridCol w:w="4900"/>
       </w:tblGrid>
       <w:tr>
         <w:trPr>
           <w:cantSplit/>
+          <w:jc w:val="center"/>
         </w:trPr>
         <w:tc>
           <w:tcPr>
-            <w:tcW w:type="dxa" w:w="2450"/>
+            <w:tcW w:w="2450" w:type="dxa"/>
           </w:tcPr>
           <w:p>
             <w:pPr>
@@ -1036,7 +1084,7 @@
         </w:tc>
         <w:tc>
           <w:tcPr>
-            <w:tcW w:type="dxa" w:w="2450"/>
+            <w:tcW w:w="2450" w:type="dxa"/>
           </w:tcPr>
           <w:p>
             <w:pPr>
@@ -1054,7 +1102,7 @@
         </w:tc>
         <w:tc>
           <w:tcPr>
-            <w:tcW w:type="dxa" w:w="4900"/>
+            <w:tcW w:w="4900" w:type="dxa"/>
           </w:tcPr>
           <w:p>
             <w:pPr>
@@ -1074,10 +1122,11 @@
       <w:tr>
         <w:trPr>
           <w:cantSplit/>
+          <w:jc w:val="center"/>
         </w:trPr>
         <w:tc>
           <w:tcPr>
-            <w:tcW w:type="dxa" w:w="2450"/>
+            <w:tcW w:w="2450" w:type="dxa"/>
           </w:tcPr>
           <w:p>
             <w:pPr>
@@ -1096,7 +1145,7 @@
         </w:tc>
         <w:tc>
           <w:tcPr>
-            <w:tcW w:type="dxa" w:w="2450"/>
+            <w:tcW w:w="2450" w:type="dxa"/>
           </w:tcPr>
           <w:p>
             <w:pPr>
@@ -1115,7 +1164,7 @@
         </w:tc>
         <w:tc>
           <w:tcPr>
-            <w:tcW w:type="dxa" w:w="4900"/>
+            <w:tcW w:w="4900" w:type="dxa"/>
           </w:tcPr>
           <w:p>
             <w:pPr>
@@ -1136,22 +1185,23 @@
       <w:tr>
         <w:trPr>
           <w:cantSplit/>
+          <w:jc w:val="center"/>
         </w:trPr>
         <w:tc>
           <w:tcPr>
-            <w:tcW w:type="dxa" w:w="2450"/>
+            <w:tcW w:w="2450" w:type="dxa"/>
           </w:tcPr>
           <w:p/>
         </w:tc>
         <w:tc>
           <w:tcPr>
-            <w:tcW w:type="dxa" w:w="2450"/>
+            <w:tcW w:w="2450" w:type="dxa"/>
           </w:tcPr>
           <w:p/>
         </w:tc>
         <w:tc>
           <w:tcPr>
-            <w:tcW w:type="dxa" w:w="4900"/>
+            <w:tcW w:w="4900" w:type="dxa"/>
           </w:tcPr>
           <w:p/>
         </w:tc>
@@ -1240,7 +1290,6 @@
         <w:tc>
           <w:tcPr>
             <w:tcW w:w="3120" w:type="dxa"/>
-            <w:shd w:val="clear" w:color="auto" w:fill="auto"/>
             <w:tcMar>
               <w:top w:w="100" w:type="dxa"/>
               <w:left w:w="100" w:type="dxa"/>
@@ -1281,7 +1330,6 @@
         <w:tc>
           <w:tcPr>
             <w:tcW w:w="6680" w:type="dxa"/>
-            <w:shd w:val="clear" w:color="auto" w:fill="auto"/>
             <w:tcMar>
               <w:top w:w="100" w:type="dxa"/>
               <w:left w:w="100" w:type="dxa"/>
@@ -1328,7 +1376,6 @@
         <w:tc>
           <w:tcPr>
             <w:tcW w:w="3120" w:type="dxa"/>
-            <w:shd w:val="clear" w:color="auto" w:fill="auto"/>
             <w:tcMar>
               <w:top w:w="100" w:type="dxa"/>
               <w:left w:w="100" w:type="dxa"/>
@@ -1358,7 +1405,6 @@
         <w:tc>
           <w:tcPr>
             <w:tcW w:w="6680" w:type="dxa"/>
-            <w:shd w:val="clear" w:color="auto" w:fill="auto"/>
             <w:tcMar>
               <w:top w:w="100" w:type="dxa"/>
               <w:left w:w="100" w:type="dxa"/>
@@ -1393,7 +1439,6 @@
         <w:tc>
           <w:tcPr>
             <w:tcW w:w="3120" w:type="dxa"/>
-            <w:shd w:val="clear" w:color="auto" w:fill="auto"/>
             <w:tcMar>
               <w:top w:w="100" w:type="dxa"/>
               <w:left w:w="100" w:type="dxa"/>
@@ -1423,7 +1468,6 @@
         <w:tc>
           <w:tcPr>
             <w:tcW w:w="6680" w:type="dxa"/>
-            <w:shd w:val="clear" w:color="auto" w:fill="auto"/>
             <w:tcMar>
               <w:top w:w="100" w:type="dxa"/>
               <w:left w:w="100" w:type="dxa"/>
@@ -1458,7 +1502,6 @@
         <w:tc>
           <w:tcPr>
             <w:tcW w:w="3120" w:type="dxa"/>
-            <w:shd w:val="clear" w:color="auto" w:fill="auto"/>
             <w:tcMar>
               <w:top w:w="100" w:type="dxa"/>
               <w:left w:w="100" w:type="dxa"/>
@@ -1488,7 +1531,6 @@
         <w:tc>
           <w:tcPr>
             <w:tcW w:w="6680" w:type="dxa"/>
-            <w:shd w:val="clear" w:color="auto" w:fill="auto"/>
             <w:tcMar>
               <w:top w:w="100" w:type="dxa"/>
               <w:left w:w="100" w:type="dxa"/>
@@ -1523,7 +1565,6 @@
         <w:tc>
           <w:tcPr>
             <w:tcW w:w="3120" w:type="dxa"/>
-            <w:shd w:val="clear" w:color="auto" w:fill="auto"/>
             <w:tcMar>
               <w:top w:w="100" w:type="dxa"/>
               <w:left w:w="100" w:type="dxa"/>
@@ -1553,7 +1594,6 @@
         <w:tc>
           <w:tcPr>
             <w:tcW w:w="6680" w:type="dxa"/>
-            <w:shd w:val="clear" w:color="auto" w:fill="auto"/>
             <w:tcMar>
               <w:top w:w="100" w:type="dxa"/>
               <w:left w:w="100" w:type="dxa"/>
@@ -1622,7 +1662,7 @@
 </file>
 
 <file path=word/endnotes.xml><?xml version="1.0" encoding="utf-8"?>
-<w:endnotes xmlns:wpc="http://schemas.microsoft.com/office/word/2010/wordprocessingCanvas" xmlns:cx="http://schemas.microsoft.com/office/drawing/2014/chartex" xmlns:cx1="http://schemas.microsoft.com/office/drawing/2015/9/8/chartex" xmlns:cx2="http://schemas.microsoft.com/office/drawing/2015/10/21/chartex" xmlns:cx3="http://schemas.microsoft.com/office/drawing/2016/5/9/chartex" xmlns:cx4="http://schemas.microsoft.com/office/drawing/2016/5/10/chartex" xmlns:cx5="http://schemas.microsoft.com/office/drawing/2016/5/11/chartex" xmlns:cx6="http://schemas.microsoft.com/office/drawing/2016/5/12/chartex" xmlns:cx7="http://schemas.microsoft.com/office/drawing/2016/5/13/chartex" xmlns:cx8="http://schemas.microsoft.com/office/drawing/2016/5/14/chartex" xmlns:mc="http://schemas.openxmlformats.org/markup-compatibility/2006" xmlns:aink="http://schemas.microsoft.com/office/drawing/2016/ink" xmlns:am3d="http://schemas.microsoft.com/office/drawing/2017/model3d" xmlns:o="urn:schemas-microsoft-com:office:office" xmlns:r="http://schemas.openxmlformats.org/officeDocument/2006/relationships" xmlns:m="http://schemas.openxmlformats.org/officeDocument/2006/math" xmlns:v="urn:schemas-microsoft-com:vml" xmlns:wp14="http://schemas.microsoft.com/office/word/2010/wordprocessingDrawing" xmlns:wp="http://schemas.openxmlformats.org/drawingml/2006/wordprocessingDrawing" xmlns:w10="urn:schemas-microsoft-com:office:word" xmlns:w="http://schemas.openxmlformats.org/wordprocessingml/2006/main" xmlns:w14="http://schemas.microsoft.com/office/word/2010/wordml" xmlns:w15="http://schemas.microsoft.com/office/word/2012/wordml" xmlns:w16cex="http://schemas.microsoft.com/office/word/2018/wordml/cex" xmlns:w16cid="http://schemas.microsoft.com/office/word/2016/wordml/cid" xmlns:w16="http://schemas.microsoft.com/office/word/2018/wordml" xmlns:w16sdtdh="http://schemas.microsoft.com/office/word/2020/wordml/sdtdatahash" xmlns:w16se="http://schemas.microsoft.com/office/word/2015/wordml/symex" xmlns:wpg="http://schemas.microsoft.com/office/word/2010/wordprocessingGroup" xmlns:wpi="http://schemas.microsoft.com/office/word/2010/wordprocessingInk" xmlns:wne="http://schemas.microsoft.com/office/word/2006/wordml" xmlns:wps="http://schemas.microsoft.com/office/word/2010/wordprocessingShape" mc:Ignorable="w14 w15 w16se w16cid w16 w16cex w16sdtdh wp14">
+<w:endnotes xmlns:wpc="http://schemas.microsoft.com/office/word/2010/wordprocessingCanvas" xmlns:cx="http://schemas.microsoft.com/office/drawing/2014/chartex" xmlns:cx1="http://schemas.microsoft.com/office/drawing/2015/9/8/chartex" xmlns:cx2="http://schemas.microsoft.com/office/drawing/2015/10/21/chartex" xmlns:cx3="http://schemas.microsoft.com/office/drawing/2016/5/9/chartex" xmlns:cx4="http://schemas.microsoft.com/office/drawing/2016/5/10/chartex" xmlns:cx5="http://schemas.microsoft.com/office/drawing/2016/5/11/chartex" xmlns:cx6="http://schemas.microsoft.com/office/drawing/2016/5/12/chartex" xmlns:cx7="http://schemas.microsoft.com/office/drawing/2016/5/13/chartex" xmlns:cx8="http://schemas.microsoft.com/office/drawing/2016/5/14/chartex" xmlns:mc="http://schemas.openxmlformats.org/markup-compatibility/2006" xmlns:aink="http://schemas.microsoft.com/office/drawing/2016/ink" xmlns:am3d="http://schemas.microsoft.com/office/drawing/2017/model3d" xmlns:o="urn:schemas-microsoft-com:office:office" xmlns:oel="http://schemas.microsoft.com/office/2019/extlst" xmlns:r="http://schemas.openxmlformats.org/officeDocument/2006/relationships" xmlns:m="http://schemas.openxmlformats.org/officeDocument/2006/math" xmlns:v="urn:schemas-microsoft-com:vml" xmlns:wp14="http://schemas.microsoft.com/office/word/2010/wordprocessingDrawing" xmlns:wp="http://schemas.openxmlformats.org/drawingml/2006/wordprocessingDrawing" xmlns:w10="urn:schemas-microsoft-com:office:word" xmlns:w="http://schemas.openxmlformats.org/wordprocessingml/2006/main" xmlns:w14="http://schemas.microsoft.com/office/word/2010/wordml" xmlns:w15="http://schemas.microsoft.com/office/word/2012/wordml" xmlns:w16cex="http://schemas.microsoft.com/office/word/2018/wordml/cex" xmlns:w16cid="http://schemas.microsoft.com/office/word/2016/wordml/cid" xmlns:w16="http://schemas.microsoft.com/office/word/2018/wordml" xmlns:w16du="http://schemas.microsoft.com/office/word/2023/wordml/word16du" xmlns:w16sdtdh="http://schemas.microsoft.com/office/word/2020/wordml/sdtdatahash" xmlns:w16sdtfl="http://schemas.microsoft.com/office/word/2024/wordml/sdtformatlock" xmlns:w16se="http://schemas.microsoft.com/office/word/2015/wordml/symex" xmlns:wpg="http://schemas.microsoft.com/office/word/2010/wordprocessingGroup" xmlns:wpi="http://schemas.microsoft.com/office/word/2010/wordprocessingInk" xmlns:wne="http://schemas.microsoft.com/office/word/2006/wordml" xmlns:wps="http://schemas.microsoft.com/office/word/2010/wordprocessingShape" mc:Ignorable="w14 w15 w16se w16cid w16 w16cex w16sdtdh w16sdtfl w16du wp14">
   <w:endnote w:type="separator" w:id="-1">
     <w:p>
       <w:pPr>
@@ -1647,7 +1687,7 @@
 </file>
 
 <file path=word/footer1.xml><?xml version="1.0" encoding="utf-8"?>
-<w:ftr xmlns:wpc="http://schemas.microsoft.com/office/word/2010/wordprocessingCanvas" xmlns:cx="http://schemas.microsoft.com/office/drawing/2014/chartex" xmlns:cx1="http://schemas.microsoft.com/office/drawing/2015/9/8/chartex" xmlns:cx2="http://schemas.microsoft.com/office/drawing/2015/10/21/chartex" xmlns:cx3="http://schemas.microsoft.com/office/drawing/2016/5/9/chartex" xmlns:cx4="http://schemas.microsoft.com/office/drawing/2016/5/10/chartex" xmlns:cx5="http://schemas.microsoft.com/office/drawing/2016/5/11/chartex" xmlns:cx6="http://schemas.microsoft.com/office/drawing/2016/5/12/chartex" xmlns:cx7="http://schemas.microsoft.com/office/drawing/2016/5/13/chartex" xmlns:cx8="http://schemas.microsoft.com/office/drawing/2016/5/14/chartex" xmlns:mc="http://schemas.openxmlformats.org/markup-compatibility/2006" xmlns:aink="http://schemas.microsoft.com/office/drawing/2016/ink" xmlns:am3d="http://schemas.microsoft.com/office/drawing/2017/model3d" xmlns:o="urn:schemas-microsoft-com:office:office" xmlns:r="http://schemas.openxmlformats.org/officeDocument/2006/relationships" xmlns:m="http://schemas.openxmlformats.org/officeDocument/2006/math" xmlns:v="urn:schemas-microsoft-com:vml" xmlns:wp14="http://schemas.microsoft.com/office/word/2010/wordprocessingDrawing" xmlns:wp="http://schemas.openxmlformats.org/drawingml/2006/wordprocessingDrawing" xmlns:w10="urn:schemas-microsoft-com:office:word" xmlns:w="http://schemas.openxmlformats.org/wordprocessingml/2006/main" xmlns:w14="http://schemas.microsoft.com/office/word/2010/wordml" xmlns:w15="http://schemas.microsoft.com/office/word/2012/wordml" xmlns:w16cex="http://schemas.microsoft.com/office/word/2018/wordml/cex" xmlns:w16cid="http://schemas.microsoft.com/office/word/2016/wordml/cid" xmlns:w16="http://schemas.microsoft.com/office/word/2018/wordml" xmlns:w16sdtdh="http://schemas.microsoft.com/office/word/2020/wordml/sdtdatahash" xmlns:w16se="http://schemas.microsoft.com/office/word/2015/wordml/symex" xmlns:wpg="http://schemas.microsoft.com/office/word/2010/wordprocessingGroup" xmlns:wpi="http://schemas.microsoft.com/office/word/2010/wordprocessingInk" xmlns:wne="http://schemas.microsoft.com/office/word/2006/wordml" xmlns:wps="http://schemas.microsoft.com/office/word/2010/wordprocessingShape" mc:Ignorable="w14 w15 w16se w16cid w16 w16cex w16sdtdh wp14">
+<w:ftr xmlns:wpc="http://schemas.microsoft.com/office/word/2010/wordprocessingCanvas" xmlns:cx="http://schemas.microsoft.com/office/drawing/2014/chartex" xmlns:cx1="http://schemas.microsoft.com/office/drawing/2015/9/8/chartex" xmlns:cx2="http://schemas.microsoft.com/office/drawing/2015/10/21/chartex" xmlns:cx3="http://schemas.microsoft.com/office/drawing/2016/5/9/chartex" xmlns:cx4="http://schemas.microsoft.com/office/drawing/2016/5/10/chartex" xmlns:cx5="http://schemas.microsoft.com/office/drawing/2016/5/11/chartex" xmlns:cx6="http://schemas.microsoft.com/office/drawing/2016/5/12/chartex" xmlns:cx7="http://schemas.microsoft.com/office/drawing/2016/5/13/chartex" xmlns:cx8="http://schemas.microsoft.com/office/drawing/2016/5/14/chartex" xmlns:mc="http://schemas.openxmlformats.org/markup-compatibility/2006" xmlns:aink="http://schemas.microsoft.com/office/drawing/2016/ink" xmlns:am3d="http://schemas.microsoft.com/office/drawing/2017/model3d" xmlns:o="urn:schemas-microsoft-com:office:office" xmlns:oel="http://schemas.microsoft.com/office/2019/extlst" xmlns:r="http://schemas.openxmlformats.org/officeDocument/2006/relationships" xmlns:m="http://schemas.openxmlformats.org/officeDocument/2006/math" xmlns:v="urn:schemas-microsoft-com:vml" xmlns:wp14="http://schemas.microsoft.com/office/word/2010/wordprocessingDrawing" xmlns:wp="http://schemas.openxmlformats.org/drawingml/2006/wordprocessingDrawing" xmlns:w10="urn:schemas-microsoft-com:office:word" xmlns:w="http://schemas.openxmlformats.org/wordprocessingml/2006/main" xmlns:w14="http://schemas.microsoft.com/office/word/2010/wordml" xmlns:w15="http://schemas.microsoft.com/office/word/2012/wordml" xmlns:w16cex="http://schemas.microsoft.com/office/word/2018/wordml/cex" xmlns:w16cid="http://schemas.microsoft.com/office/word/2016/wordml/cid" xmlns:w16="http://schemas.microsoft.com/office/word/2018/wordml" xmlns:w16du="http://schemas.microsoft.com/office/word/2023/wordml/word16du" xmlns:w16sdtdh="http://schemas.microsoft.com/office/word/2020/wordml/sdtdatahash" xmlns:w16sdtfl="http://schemas.microsoft.com/office/word/2024/wordml/sdtformatlock" xmlns:w16se="http://schemas.microsoft.com/office/word/2015/wordml/symex" xmlns:wpg="http://schemas.microsoft.com/office/word/2010/wordprocessingGroup" xmlns:wpi="http://schemas.microsoft.com/office/word/2010/wordprocessingInk" xmlns:wne="http://schemas.microsoft.com/office/word/2006/wordml" xmlns:wps="http://schemas.microsoft.com/office/word/2010/wordprocessingShape" mc:Ignorable="w14 w15 w16se w16cid w16 w16cex w16sdtdh w16sdtfl w16du wp14">
   <w:p>
     <w:pPr>
       <w:jc w:val="center"/>
@@ -1716,7 +1756,6 @@
       </w:rPr>
       <w:t xml:space="preserve">CCE 270 - Computer Methods </w:t>
     </w:r>
-    <w:proofErr w:type="gramStart"/>
     <w:r>
       <w:rPr>
         <w:rFonts w:ascii="Nunito" w:eastAsia="Nunito" w:hAnsi="Nunito" w:cs="Nunito"/>
@@ -1731,15 +1770,7 @@
         <w:rFonts w:ascii="Nunito" w:eastAsia="Nunito" w:hAnsi="Nunito" w:cs="Nunito"/>
         <w:i/>
       </w:rPr>
-      <w:t xml:space="preserve">  Brigham</w:t>
-    </w:r>
-    <w:proofErr w:type="gramEnd"/>
-    <w:r>
-      <w:rPr>
-        <w:rFonts w:ascii="Nunito" w:eastAsia="Nunito" w:hAnsi="Nunito" w:cs="Nunito"/>
-        <w:i/>
-      </w:rPr>
-      <w:t xml:space="preserve"> Young University   </w:t>
+      <w:t xml:space="preserve">  Brigham Young University   </w:t>
     </w:r>
     <w:r>
       <w:rPr>
@@ -1840,7 +1871,7 @@
 </file>
 
 <file path=word/footnotes.xml><?xml version="1.0" encoding="utf-8"?>
-<w:footnotes xmlns:wpc="http://schemas.microsoft.com/office/word/2010/wordprocessingCanvas" xmlns:cx="http://schemas.microsoft.com/office/drawing/2014/chartex" xmlns:cx1="http://schemas.microsoft.com/office/drawing/2015/9/8/chartex" xmlns:cx2="http://schemas.microsoft.com/office/drawing/2015/10/21/chartex" xmlns:cx3="http://schemas.microsoft.com/office/drawing/2016/5/9/chartex" xmlns:cx4="http://schemas.microsoft.com/office/drawing/2016/5/10/chartex" xmlns:cx5="http://schemas.microsoft.com/office/drawing/2016/5/11/chartex" xmlns:cx6="http://schemas.microsoft.com/office/drawing/2016/5/12/chartex" xmlns:cx7="http://schemas.microsoft.com/office/drawing/2016/5/13/chartex" xmlns:cx8="http://schemas.microsoft.com/office/drawing/2016/5/14/chartex" xmlns:mc="http://schemas.openxmlformats.org/markup-compatibility/2006" xmlns:aink="http://schemas.microsoft.com/office/drawing/2016/ink" xmlns:am3d="http://schemas.microsoft.com/office/drawing/2017/model3d" xmlns:o="urn:schemas-microsoft-com:office:office" xmlns:r="http://schemas.openxmlformats.org/officeDocument/2006/relationships" xmlns:m="http://schemas.openxmlformats.org/officeDocument/2006/math" xmlns:v="urn:schemas-microsoft-com:vml" xmlns:wp14="http://schemas.microsoft.com/office/word/2010/wordprocessingDrawing" xmlns:wp="http://schemas.openxmlformats.org/drawingml/2006/wordprocessingDrawing" xmlns:w10="urn:schemas-microsoft-com:office:word" xmlns:w="http://schemas.openxmlformats.org/wordprocessingml/2006/main" xmlns:w14="http://schemas.microsoft.com/office/word/2010/wordml" xmlns:w15="http://schemas.microsoft.com/office/word/2012/wordml" xmlns:w16cex="http://schemas.microsoft.com/office/word/2018/wordml/cex" xmlns:w16cid="http://schemas.microsoft.com/office/word/2016/wordml/cid" xmlns:w16="http://schemas.microsoft.com/office/word/2018/wordml" xmlns:w16sdtdh="http://schemas.microsoft.com/office/word/2020/wordml/sdtdatahash" xmlns:w16se="http://schemas.microsoft.com/office/word/2015/wordml/symex" xmlns:wpg="http://schemas.microsoft.com/office/word/2010/wordprocessingGroup" xmlns:wpi="http://schemas.microsoft.com/office/word/2010/wordprocessingInk" xmlns:wne="http://schemas.microsoft.com/office/word/2006/wordml" xmlns:wps="http://schemas.microsoft.com/office/word/2010/wordprocessingShape" mc:Ignorable="w14 w15 w16se w16cid w16 w16cex w16sdtdh wp14">
+<w:footnotes xmlns:wpc="http://schemas.microsoft.com/office/word/2010/wordprocessingCanvas" xmlns:cx="http://schemas.microsoft.com/office/drawing/2014/chartex" xmlns:cx1="http://schemas.microsoft.com/office/drawing/2015/9/8/chartex" xmlns:cx2="http://schemas.microsoft.com/office/drawing/2015/10/21/chartex" xmlns:cx3="http://schemas.microsoft.com/office/drawing/2016/5/9/chartex" xmlns:cx4="http://schemas.microsoft.com/office/drawing/2016/5/10/chartex" xmlns:cx5="http://schemas.microsoft.com/office/drawing/2016/5/11/chartex" xmlns:cx6="http://schemas.microsoft.com/office/drawing/2016/5/12/chartex" xmlns:cx7="http://schemas.microsoft.com/office/drawing/2016/5/13/chartex" xmlns:cx8="http://schemas.microsoft.com/office/drawing/2016/5/14/chartex" xmlns:mc="http://schemas.openxmlformats.org/markup-compatibility/2006" xmlns:aink="http://schemas.microsoft.com/office/drawing/2016/ink" xmlns:am3d="http://schemas.microsoft.com/office/drawing/2017/model3d" xmlns:o="urn:schemas-microsoft-com:office:office" xmlns:oel="http://schemas.microsoft.com/office/2019/extlst" xmlns:r="http://schemas.openxmlformats.org/officeDocument/2006/relationships" xmlns:m="http://schemas.openxmlformats.org/officeDocument/2006/math" xmlns:v="urn:schemas-microsoft-com:vml" xmlns:wp14="http://schemas.microsoft.com/office/word/2010/wordprocessingDrawing" xmlns:wp="http://schemas.openxmlformats.org/drawingml/2006/wordprocessingDrawing" xmlns:w10="urn:schemas-microsoft-com:office:word" xmlns:w="http://schemas.openxmlformats.org/wordprocessingml/2006/main" xmlns:w14="http://schemas.microsoft.com/office/word/2010/wordml" xmlns:w15="http://schemas.microsoft.com/office/word/2012/wordml" xmlns:w16cex="http://schemas.microsoft.com/office/word/2018/wordml/cex" xmlns:w16cid="http://schemas.microsoft.com/office/word/2016/wordml/cid" xmlns:w16="http://schemas.microsoft.com/office/word/2018/wordml" xmlns:w16du="http://schemas.microsoft.com/office/word/2023/wordml/word16du" xmlns:w16sdtdh="http://schemas.microsoft.com/office/word/2020/wordml/sdtdatahash" xmlns:w16sdtfl="http://schemas.microsoft.com/office/word/2024/wordml/sdtformatlock" xmlns:w16se="http://schemas.microsoft.com/office/word/2015/wordml/symex" xmlns:wpg="http://schemas.microsoft.com/office/word/2010/wordprocessingGroup" xmlns:wpi="http://schemas.microsoft.com/office/word/2010/wordprocessingInk" xmlns:wne="http://schemas.microsoft.com/office/word/2006/wordml" xmlns:wps="http://schemas.microsoft.com/office/word/2010/wordprocessingShape" mc:Ignorable="w14 w15 w16se w16cid w16 w16cex w16sdtdh w16sdtfl w16du wp14">
   <w:footnote w:type="separator" w:id="-1">
     <w:p>
       <w:pPr>
@@ -1865,7 +1896,7 @@
 </file>
 
 <file path=word/header1.xml><?xml version="1.0" encoding="utf-8"?>
-<w:hdr xmlns:wpc="http://schemas.microsoft.com/office/word/2010/wordprocessingCanvas" xmlns:cx="http://schemas.microsoft.com/office/drawing/2014/chartex" xmlns:cx1="http://schemas.microsoft.com/office/drawing/2015/9/8/chartex" xmlns:cx2="http://schemas.microsoft.com/office/drawing/2015/10/21/chartex" xmlns:cx3="http://schemas.microsoft.com/office/drawing/2016/5/9/chartex" xmlns:cx4="http://schemas.microsoft.com/office/drawing/2016/5/10/chartex" xmlns:cx5="http://schemas.microsoft.com/office/drawing/2016/5/11/chartex" xmlns:cx6="http://schemas.microsoft.com/office/drawing/2016/5/12/chartex" xmlns:cx7="http://schemas.microsoft.com/office/drawing/2016/5/13/chartex" xmlns:cx8="http://schemas.microsoft.com/office/drawing/2016/5/14/chartex" xmlns:mc="http://schemas.openxmlformats.org/markup-compatibility/2006" xmlns:aink="http://schemas.microsoft.com/office/drawing/2016/ink" xmlns:am3d="http://schemas.microsoft.com/office/drawing/2017/model3d" xmlns:o="urn:schemas-microsoft-com:office:office" xmlns:r="http://schemas.openxmlformats.org/officeDocument/2006/relationships" xmlns:m="http://schemas.openxmlformats.org/officeDocument/2006/math" xmlns:v="urn:schemas-microsoft-com:vml" xmlns:wp14="http://schemas.microsoft.com/office/word/2010/wordprocessingDrawing" xmlns:wp="http://schemas.openxmlformats.org/drawingml/2006/wordprocessingDrawing" xmlns:w10="urn:schemas-microsoft-com:office:word" xmlns:w="http://schemas.openxmlformats.org/wordprocessingml/2006/main" xmlns:w14="http://schemas.microsoft.com/office/word/2010/wordml" xmlns:w15="http://schemas.microsoft.com/office/word/2012/wordml" xmlns:w16cex="http://schemas.microsoft.com/office/word/2018/wordml/cex" xmlns:w16cid="http://schemas.microsoft.com/office/word/2016/wordml/cid" xmlns:w16="http://schemas.microsoft.com/office/word/2018/wordml" xmlns:w16sdtdh="http://schemas.microsoft.com/office/word/2020/wordml/sdtdatahash" xmlns:w16se="http://schemas.microsoft.com/office/word/2015/wordml/symex" xmlns:wpg="http://schemas.microsoft.com/office/word/2010/wordprocessingGroup" xmlns:wpi="http://schemas.microsoft.com/office/word/2010/wordprocessingInk" xmlns:wne="http://schemas.microsoft.com/office/word/2006/wordml" xmlns:wps="http://schemas.microsoft.com/office/word/2010/wordprocessingShape" mc:Ignorable="w14 w15 w16se w16cid w16 w16cex w16sdtdh wp14">
+<w:hdr xmlns:wpc="http://schemas.microsoft.com/office/word/2010/wordprocessingCanvas" xmlns:cx="http://schemas.microsoft.com/office/drawing/2014/chartex" xmlns:cx1="http://schemas.microsoft.com/office/drawing/2015/9/8/chartex" xmlns:cx2="http://schemas.microsoft.com/office/drawing/2015/10/21/chartex" xmlns:cx3="http://schemas.microsoft.com/office/drawing/2016/5/9/chartex" xmlns:cx4="http://schemas.microsoft.com/office/drawing/2016/5/10/chartex" xmlns:cx5="http://schemas.microsoft.com/office/drawing/2016/5/11/chartex" xmlns:cx6="http://schemas.microsoft.com/office/drawing/2016/5/12/chartex" xmlns:cx7="http://schemas.microsoft.com/office/drawing/2016/5/13/chartex" xmlns:cx8="http://schemas.microsoft.com/office/drawing/2016/5/14/chartex" xmlns:mc="http://schemas.openxmlformats.org/markup-compatibility/2006" xmlns:aink="http://schemas.microsoft.com/office/drawing/2016/ink" xmlns:am3d="http://schemas.microsoft.com/office/drawing/2017/model3d" xmlns:o="urn:schemas-microsoft-com:office:office" xmlns:oel="http://schemas.microsoft.com/office/2019/extlst" xmlns:r="http://schemas.openxmlformats.org/officeDocument/2006/relationships" xmlns:m="http://schemas.openxmlformats.org/officeDocument/2006/math" xmlns:v="urn:schemas-microsoft-com:vml" xmlns:wp14="http://schemas.microsoft.com/office/word/2010/wordprocessingDrawing" xmlns:wp="http://schemas.openxmlformats.org/drawingml/2006/wordprocessingDrawing" xmlns:w10="urn:schemas-microsoft-com:office:word" xmlns:w="http://schemas.openxmlformats.org/wordprocessingml/2006/main" xmlns:w14="http://schemas.microsoft.com/office/word/2010/wordml" xmlns:w15="http://schemas.microsoft.com/office/word/2012/wordml" xmlns:w16cex="http://schemas.microsoft.com/office/word/2018/wordml/cex" xmlns:w16cid="http://schemas.microsoft.com/office/word/2016/wordml/cid" xmlns:w16="http://schemas.microsoft.com/office/word/2018/wordml" xmlns:w16du="http://schemas.microsoft.com/office/word/2023/wordml/word16du" xmlns:w16sdtdh="http://schemas.microsoft.com/office/word/2020/wordml/sdtdatahash" xmlns:w16sdtfl="http://schemas.microsoft.com/office/word/2024/wordml/sdtformatlock" xmlns:w16se="http://schemas.microsoft.com/office/word/2015/wordml/symex" xmlns:wpg="http://schemas.microsoft.com/office/word/2010/wordprocessingGroup" xmlns:wpi="http://schemas.microsoft.com/office/word/2010/wordprocessingInk" xmlns:wne="http://schemas.microsoft.com/office/word/2006/wordml" xmlns:wps="http://schemas.microsoft.com/office/word/2010/wordprocessingShape" mc:Ignorable="w14 w15 w16se w16cid w16 w16cex w16sdtdh w16sdtfl w16du wp14">
   <w:p>
     <w:pPr>
       <w:widowControl w:val="0"/>
@@ -1906,7 +1937,7 @@
 </file>
 
 <file path=word/styles.xml><?xml version="1.0" encoding="utf-8"?>
-<w:styles xmlns:mc="http://schemas.openxmlformats.org/markup-compatibility/2006" xmlns:r="http://schemas.openxmlformats.org/officeDocument/2006/relationships" xmlns:w="http://schemas.openxmlformats.org/wordprocessingml/2006/main" xmlns:w14="http://schemas.microsoft.com/office/word/2010/wordml" xmlns:w15="http://schemas.microsoft.com/office/word/2012/wordml" xmlns:w16cex="http://schemas.microsoft.com/office/word/2018/wordml/cex" xmlns:w16cid="http://schemas.microsoft.com/office/word/2016/wordml/cid" xmlns:w16="http://schemas.microsoft.com/office/word/2018/wordml" xmlns:w16sdtdh="http://schemas.microsoft.com/office/word/2020/wordml/sdtdatahash" xmlns:w16se="http://schemas.microsoft.com/office/word/2015/wordml/symex" mc:Ignorable="w14 w15 w16se w16cid w16 w16cex w16sdtdh">
+<w:styles xmlns:mc="http://schemas.openxmlformats.org/markup-compatibility/2006" xmlns:r="http://schemas.openxmlformats.org/officeDocument/2006/relationships" xmlns:w="http://schemas.openxmlformats.org/wordprocessingml/2006/main" xmlns:w14="http://schemas.microsoft.com/office/word/2010/wordml" xmlns:w15="http://schemas.microsoft.com/office/word/2012/wordml" xmlns:w16cex="http://schemas.microsoft.com/office/word/2018/wordml/cex" xmlns:w16cid="http://schemas.microsoft.com/office/word/2016/wordml/cid" xmlns:w16="http://schemas.microsoft.com/office/word/2018/wordml" xmlns:w16du="http://schemas.microsoft.com/office/word/2023/wordml/word16du" xmlns:w16sdtdh="http://schemas.microsoft.com/office/word/2020/wordml/sdtdatahash" xmlns:w16sdtfl="http://schemas.microsoft.com/office/word/2024/wordml/sdtformatlock" xmlns:w16se="http://schemas.microsoft.com/office/word/2015/wordml/symex" mc:Ignorable="w14 w15 w16se w16cid w16 w16cex w16sdtdh w16sdtfl w16du">
   <w:docDefaults>
     <w:rPrDefault>
       <w:rPr>

</xml_diff>